<commit_message>
Add web logins, LLM fallback providers, liquidity signals, and option P&L
- Users table and session-based web login (API, login page, nav)
- Fallback LLM providers (Groq, Google, Hugging Face) when the primary has no key or fails
- Groww broker, liquidity signal job with launchd plist, option P&L and performance metrics
- Minimum-tick slippage in simulated costs; candle chart and markets page updates
- Audit reports, flow diagrams, and refreshed architecture docs

Co-authored-by: Cursor <cursoragent@cursor.com>
</commit_message>
<xml_diff>
--- a/DocumentsAndDiagrams/docx/CURRENT_SYSTEM_ARCHITECTURE_ANALYSIS.docx
+++ b/DocumentsAndDiagrams/docx/CURRENT_SYSTEM_ARCHITECTURE_ANALYSIS.docx
@@ -11776,6 +11776,50 @@
       </w:r>
     </w:p>
     <w:p>
+      <w:pPr/>
+      <w:r>
+        <w:rPr>
+          <w:rFonts w:ascii="Helvetica" w:hAnsi="Helvetica" w:cs="Helvetica"/>
+          <w:sz w:val="25"/>
+          <w:sz-cs w:val="25"/>
+          <w:spacing w:val="0"/>
+          <w:color w:val="151312"/>
+        </w:rPr>
+        <w:t xml:space="preserve"/>
+      </w:r>
+      <w:r>
+        <w:rPr>
+          <w:rFonts w:ascii="Helvetica" w:hAnsi="Helvetica" w:cs="Helvetica"/>
+          <w:sz w:val="25"/>
+          <w:sz-cs w:val="25"/>
+          <w:spacing w:val="0"/>
+          <w:color w:val="151312"/>
+        </w:rPr>
+        <w:t xml:space="preserve"> </w:t>
+      </w:r>
+      <w:r>
+        <w:rPr>
+          <w:rFonts w:ascii="Helvetica" w:hAnsi="Helvetica" w:cs="Helvetica"/>
+          <w:sz w:val="25"/>
+          <w:sz-cs w:val="25"/>
+          <w:spacing w:val="0"/>
+          <w:color w:val="151312"/>
+        </w:rPr>
+        <w:t xml:space="preserve"/>
+      </w:r>
+      <w:r>
+        <w:rPr>
+          <w:rFonts w:ascii="Helvetica" w:hAnsi="Helvetica" w:cs="Helvetica"/>
+          <w:sz w:val="28"/>
+          <w:sz-cs w:val="28"/>
+          <w:b/>
+          <w:spacing w:val="0"/>
+          <w:color w:val="151312"/>
+        </w:rPr>
+        <w:t xml:space="preserve"/>
+      </w:r>
+    </w:p>
+    <w:p>
       <w:pPr>
         <w:spacing w:after="280"/>
       </w:pPr>
@@ -11792,6 +11836,29 @@
       </w:r>
     </w:p>
     <w:p>
+      <w:pPr/>
+      <w:r>
+        <w:rPr>
+          <w:rFonts w:ascii="Helvetica" w:hAnsi="Helvetica" w:cs="Helvetica"/>
+          <w:sz w:val="25"/>
+          <w:sz-cs w:val="25"/>
+          <w:spacing w:val="0"/>
+          <w:color w:val="151312"/>
+        </w:rPr>
+        <w:t xml:space="preserve"/>
+      </w:r>
+      <w:r>
+        <w:rPr>
+          <w:rFonts w:ascii="Helvetica" w:hAnsi="Helvetica" w:cs="Helvetica"/>
+          <w:sz w:val="25"/>
+          <w:sz-cs w:val="25"/>
+          <w:spacing w:val="0"/>
+          <w:color w:val="151312"/>
+        </w:rPr>
+        <w:t xml:space="preserve"/>
+      </w:r>
+    </w:p>
+    <w:p>
       <w:pPr>
         <w:spacing w:after="250"/>
       </w:pPr>
@@ -11923,6 +11990,29 @@
       </w:r>
     </w:p>
     <w:p>
+      <w:pPr/>
+      <w:r>
+        <w:rPr>
+          <w:rFonts w:ascii="Helvetica" w:hAnsi="Helvetica" w:cs="Helvetica"/>
+          <w:sz w:val="25"/>
+          <w:sz-cs w:val="25"/>
+          <w:spacing w:val="0"/>
+          <w:color w:val="151312"/>
+        </w:rPr>
+        <w:t xml:space="preserve"/>
+      </w:r>
+      <w:r>
+        <w:rPr>
+          <w:rFonts w:ascii="Helvetica" w:hAnsi="Helvetica" w:cs="Helvetica"/>
+          <w:sz w:val="25"/>
+          <w:sz-cs w:val="25"/>
+          <w:spacing w:val="0"/>
+          <w:color w:val="151312"/>
+        </w:rPr>
+        <w:t xml:space="preserve"/>
+      </w:r>
+    </w:p>
+    <w:p>
       <w:pPr>
         <w:spacing w:after="250"/>
       </w:pPr>
@@ -12051,6 +12141,29 @@
           <w:color w:val="151312"/>
         </w:rPr>
         <w:t xml:space="preserve">Manual paper trade</w:t>
+      </w:r>
+    </w:p>
+    <w:p>
+      <w:pPr/>
+      <w:r>
+        <w:rPr>
+          <w:rFonts w:ascii="Helvetica" w:hAnsi="Helvetica" w:cs="Helvetica"/>
+          <w:sz w:val="25"/>
+          <w:sz-cs w:val="25"/>
+          <w:spacing w:val="0"/>
+          <w:color w:val="151312"/>
+        </w:rPr>
+        <w:t xml:space="preserve"/>
+      </w:r>
+      <w:r>
+        <w:rPr>
+          <w:rFonts w:ascii="Helvetica" w:hAnsi="Helvetica" w:cs="Helvetica"/>
+          <w:sz w:val="25"/>
+          <w:sz-cs w:val="25"/>
+          <w:spacing w:val="0"/>
+          <w:color w:val="151312"/>
+        </w:rPr>
+        <w:t xml:space="preserve"/>
       </w:r>
     </w:p>
     <w:p>

</xml_diff>